<commit_message>
Separate current SOD snapshot from dependency dataset
</commit_message>
<xml_diff>
--- a/data/autosys_sod_eta/AutoSys_SOD_ETA_Data_Guide.docx
+++ b/data/autosys_sod_eta/AutoSys_SOD_ETA_Data_Guide.docx
@@ -70,7 +70,27 @@
         <w:rPr>
           <w:b w:val="0"/>
         </w:rPr>
-        <w:t>: static BOX/CMD definitions, dependency DAGs, schedules, SLAs, and a current SOD status snapshot.</w:t>
+        <w:t>: static BOX/CMD definitions, dependency DAGs, schedules, and SLAs.</w:t>
+      </w:r>
+    </w:p>
+    <w:p>
+      <w:pPr>
+        <w:pStyle w:val="ListBullet"/>
+        <w:spacing w:after="40"/>
+      </w:pPr>
+      <w:r>
+        <w:rPr>
+          <w:rFonts w:ascii="Consolas" w:hAnsi="Consolas"/>
+          <w:color w:val="2D2D2D"/>
+          <w:sz w:val="18"/>
+        </w:rPr>
+        <w:t>autosys_current_sod_snapshot.json</w:t>
+      </w:r>
+      <w:r>
+        <w:rPr>
+          <w:b w:val="0"/>
+        </w:rPr>
+        <w:t>: current-day BOX/CMD states used for live ETA calculation and status-email generation.</w:t>
       </w:r>
     </w:p>
     <w:p>
@@ -111,7 +131,7 @@
         <w:rPr>
           <w:b w:val="0"/>
         </w:rPr>
-        <w:t xml:space="preserve">: deterministic generator for both JSON datasets. It uses only the Python standard library and seed </w:t>
+        <w:t xml:space="preserve">: deterministic generator for all three JSON datasets. It uses only the Python standard library and seed </w:t>
       </w:r>
       <w:r>
         <w:rPr>
@@ -304,7 +324,7 @@
         <w:rPr>
           <w:b w:val="0"/>
         </w:rPr>
-        <w:t>This file is one JSON object with four top-level fields.</w:t>
+        <w:t>This file is one JSON object with three top-level fields.</w:t>
       </w:r>
     </w:p>
     <w:tbl>
@@ -653,89 +673,6 @@
                 <w:sz w:val="18"/>
               </w:rPr>
               <w:t>All BOX and CMD definitions for APAC, EMEA, and AMER.</w:t>
-            </w:r>
-          </w:p>
-        </w:tc>
-      </w:tr>
-      <w:tr>
-        <w:trPr>
-          <w:cantSplit w:val="true"/>
-        </w:trPr>
-        <w:tc>
-          <w:tcPr>
-            <w:tcW w:type="dxa" w:w="2376"/>
-            <w:vAlign w:val="center"/>
-            <w:tcMar>
-              <w:top w:w="90" w:type="dxa"/>
-              <w:start w:w="100" w:type="dxa"/>
-              <w:bottom w:w="90" w:type="dxa"/>
-              <w:end w:w="100" w:type="dxa"/>
-            </w:tcMar>
-            <w:shd w:fill="EAF1F8"/>
-          </w:tcPr>
-          <w:p>
-            <w:pPr>
-              <w:spacing w:after="0" w:line="240" w:lineRule="auto"/>
-            </w:pPr>
-            <w:r>
-              <w:rPr>
-                <w:rFonts w:ascii="Consolas" w:hAnsi="Consolas"/>
-                <w:color w:val="2D2D2D"/>
-                <w:sz w:val="18"/>
-              </w:rPr>
-              <w:t>current_sod_snapshot</w:t>
-            </w:r>
-          </w:p>
-        </w:tc>
-        <w:tc>
-          <w:tcPr>
-            <w:tcW w:type="dxa" w:w="1512"/>
-            <w:vAlign w:val="center"/>
-            <w:tcMar>
-              <w:top w:w="90" w:type="dxa"/>
-              <w:start w:w="100" w:type="dxa"/>
-              <w:bottom w:w="90" w:type="dxa"/>
-              <w:end w:w="100" w:type="dxa"/>
-            </w:tcMar>
-            <w:shd w:fill="EAF1F8"/>
-          </w:tcPr>
-          <w:p>
-            <w:pPr>
-              <w:spacing w:after="0" w:line="240" w:lineRule="auto"/>
-            </w:pPr>
-            <w:r>
-              <w:rPr>
-                <w:rFonts w:ascii="Aptos" w:hAnsi="Aptos"/>
-                <w:b w:val="0"/>
-                <w:sz w:val="18"/>
-              </w:rPr>
-              <w:t>object</w:t>
-            </w:r>
-          </w:p>
-        </w:tc>
-        <w:tc>
-          <w:tcPr>
-            <w:tcW w:type="dxa" w:w="6278"/>
-            <w:vAlign w:val="center"/>
-            <w:tcMar>
-              <w:top w:w="90" w:type="dxa"/>
-              <w:start w:w="100" w:type="dxa"/>
-              <w:bottom w:w="90" w:type="dxa"/>
-              <w:end w:w="100" w:type="dxa"/>
-            </w:tcMar>
-            <w:shd w:fill="EAF1F8"/>
-          </w:tcPr>
-          <w:p>
-            <w:pPr>
-              <w:spacing w:after="0" w:line="240" w:lineRule="auto"/>
-            </w:pPr>
-            <w:r>
-              <w:rPr>
-                <w:rFonts w:ascii="Aptos" w:hAnsi="Aptos"/>
-                <w:b w:val="0"/>
-                <w:sz w:val="18"/>
-              </w:rPr>
-              <w:t>Current job states used for live ETA and status-email generation.</w:t>
             </w:r>
           </w:p>
         </w:tc>
@@ -1745,10 +1682,18 @@
     </w:p>
     <w:p>
       <w:pPr>
-        <w:pStyle w:val="Heading2"/>
+        <w:pStyle w:val="Heading1"/>
       </w:pPr>
       <w:r>
-        <w:t>Current SOD snapshot</w:t>
+        <w:t>Dataset 2 AutoSys current SOD snapshot JSON</w:t>
+      </w:r>
+    </w:p>
+    <w:p>
+      <w:r>
+        <w:rPr>
+          <w:b w:val="0"/>
+        </w:rPr>
+        <w:t>This standalone file represents the live scheduler state at a particular point in the current SOD run. Keeping it separate from the static dependency catalog lets participants update or replace the live state without modifying the job definitions.</w:t>
       </w:r>
     </w:p>
     <w:tbl>
@@ -2338,7 +2283,7 @@
         <w:pStyle w:val="Heading1"/>
       </w:pPr>
       <w:r>
-        <w:t>Dataset 2 AutoSys execution history JSON</w:t>
+        <w:t>Dataset 3 AutoSys execution history JSON</w:t>
       </w:r>
     </w:p>
     <w:p>

</xml_diff>

<commit_message>
Refactor application components and update supporting logic
</commit_message>
<xml_diff>
--- a/data/autosys_sod_eta/AutoSys_SOD_ETA_Data_Guide.docx
+++ b/data/autosys_sod_eta/AutoSys_SOD_ETA_Data_Guide.docx
@@ -90,7 +90,7 @@
         <w:rPr>
           <w:b w:val="0"/>
         </w:rPr>
-        <w:t>: current-day BOX/CMD states used for live ETA calculation and status-email generation.</w:t>
+        <w:t>: five daily BOX/CMD status snapshots used for live ETA calculation and status-email generation.</w:t>
       </w:r>
     </w:p>
     <w:p>
@@ -1693,7 +1693,327 @@
         <w:rPr>
           <w:b w:val="0"/>
         </w:rPr>
-        <w:t>This standalone file represents the live scheduler state at a particular point in the current SOD run. Keeping it separate from the static dependency catalog lets participants update or replace the live state without modifying the job definitions.</w:t>
+        <w:t xml:space="preserve">This standalone file contains five independent point-in-time scheduler snapshots for </w:t>
+      </w:r>
+      <w:r>
+        <w:rPr>
+          <w:rFonts w:ascii="Consolas" w:hAnsi="Consolas"/>
+          <w:color w:val="2D2D2D"/>
+          <w:sz w:val="18"/>
+        </w:rPr>
+        <w:t>2026-09-21</w:t>
+      </w:r>
+      <w:r>
+        <w:rPr>
+          <w:b w:val="0"/>
+        </w:rPr>
+        <w:t xml:space="preserve"> through </w:t>
+      </w:r>
+      <w:r>
+        <w:rPr>
+          <w:rFonts w:ascii="Consolas" w:hAnsi="Consolas"/>
+          <w:color w:val="2D2D2D"/>
+          <w:sz w:val="18"/>
+        </w:rPr>
+        <w:t>2026-09-25</w:t>
+      </w:r>
+      <w:r>
+        <w:rPr>
+          <w:b w:val="0"/>
+        </w:rPr>
+        <w:t>. Keeping status data separate from the static dependency catalog lets participants select, update, or replace a daily state without modifying the job definitions. The scenarios cover a delayed extract, running enrichment, running report build, failed validation with blocked downstream jobs, and successful recovery.</w:t>
+      </w:r>
+    </w:p>
+    <w:p>
+      <w:pPr>
+        <w:pStyle w:val="Heading3"/>
+      </w:pPr>
+      <w:r>
+        <w:t>Top level fields</w:t>
+      </w:r>
+    </w:p>
+    <w:tbl>
+      <w:tblPr>
+        <w:tblW w:type="auto" w:w="0"/>
+        <w:jc w:val="center"/>
+        <w:tblLayout w:type="fixed"/>
+        <w:tblLook w:firstColumn="1" w:firstRow="1" w:lastColumn="0" w:lastRow="0" w:noHBand="0" w:noVBand="1" w:val="04A0"/>
+        <w:tblBorders>
+          <w:top w:val="single" w:sz="4" w:color="D9D9D9"/>
+          <w:left w:val="single" w:sz="4" w:color="D9D9D9"/>
+          <w:bottom w:val="single" w:sz="4" w:color="D9D9D9"/>
+          <w:right w:val="single" w:sz="4" w:color="D9D9D9"/>
+          <w:insideH w:val="single" w:sz="4" w:color="D9D9D9"/>
+          <w:insideV w:val="single" w:sz="4" w:color="D9D9D9"/>
+        </w:tblBorders>
+      </w:tblPr>
+      <w:tblGrid>
+        <w:gridCol w:w="3389"/>
+        <w:gridCol w:w="3389"/>
+        <w:gridCol w:w="3389"/>
+      </w:tblGrid>
+      <w:tr>
+        <w:trPr>
+          <w:tblHeader w:val="true"/>
+          <w:cantSplit w:val="true"/>
+        </w:trPr>
+        <w:tc>
+          <w:tcPr>
+            <w:tcW w:type="dxa" w:w="2376"/>
+            <w:vAlign w:val="center"/>
+            <w:tcMar>
+              <w:top w:w="90" w:type="dxa"/>
+              <w:start w:w="100" w:type="dxa"/>
+              <w:bottom w:w="90" w:type="dxa"/>
+              <w:end w:w="100" w:type="dxa"/>
+            </w:tcMar>
+            <w:shd w:fill="17365D"/>
+          </w:tcPr>
+          <w:p>
+            <w:pPr>
+              <w:spacing w:after="0" w:line="240" w:lineRule="auto"/>
+            </w:pPr>
+            <w:r>
+              <w:rPr>
+                <w:rFonts w:ascii="Aptos" w:hAnsi="Aptos"/>
+                <w:b/>
+                <w:color w:val="FFFFFF"/>
+                <w:sz w:val="18"/>
+              </w:rPr>
+              <w:t>Field</w:t>
+            </w:r>
+          </w:p>
+        </w:tc>
+        <w:tc>
+          <w:tcPr>
+            <w:tcW w:type="dxa" w:w="1512"/>
+            <w:vAlign w:val="center"/>
+            <w:tcMar>
+              <w:top w:w="90" w:type="dxa"/>
+              <w:start w:w="100" w:type="dxa"/>
+              <w:bottom w:w="90" w:type="dxa"/>
+              <w:end w:w="100" w:type="dxa"/>
+            </w:tcMar>
+            <w:shd w:fill="17365D"/>
+          </w:tcPr>
+          <w:p>
+            <w:pPr>
+              <w:spacing w:after="0" w:line="240" w:lineRule="auto"/>
+            </w:pPr>
+            <w:r>
+              <w:rPr>
+                <w:rFonts w:ascii="Aptos" w:hAnsi="Aptos"/>
+                <w:b/>
+                <w:color w:val="FFFFFF"/>
+                <w:sz w:val="18"/>
+              </w:rPr>
+              <w:t>Type</w:t>
+            </w:r>
+          </w:p>
+        </w:tc>
+        <w:tc>
+          <w:tcPr>
+            <w:tcW w:type="dxa" w:w="6278"/>
+            <w:vAlign w:val="center"/>
+            <w:tcMar>
+              <w:top w:w="90" w:type="dxa"/>
+              <w:start w:w="100" w:type="dxa"/>
+              <w:bottom w:w="90" w:type="dxa"/>
+              <w:end w:w="100" w:type="dxa"/>
+            </w:tcMar>
+            <w:shd w:fill="17365D"/>
+          </w:tcPr>
+          <w:p>
+            <w:pPr>
+              <w:spacing w:after="0" w:line="240" w:lineRule="auto"/>
+            </w:pPr>
+            <w:r>
+              <w:rPr>
+                <w:rFonts w:ascii="Aptos" w:hAnsi="Aptos"/>
+                <w:b/>
+                <w:color w:val="FFFFFF"/>
+                <w:sz w:val="18"/>
+              </w:rPr>
+              <w:t>Description</w:t>
+            </w:r>
+          </w:p>
+        </w:tc>
+      </w:tr>
+      <w:tr>
+        <w:trPr>
+          <w:cantSplit w:val="true"/>
+        </w:trPr>
+        <w:tc>
+          <w:tcPr>
+            <w:tcW w:type="dxa" w:w="2376"/>
+            <w:vAlign w:val="center"/>
+            <w:tcMar>
+              <w:top w:w="90" w:type="dxa"/>
+              <w:start w:w="100" w:type="dxa"/>
+              <w:bottom w:w="90" w:type="dxa"/>
+              <w:end w:w="100" w:type="dxa"/>
+            </w:tcMar>
+          </w:tcPr>
+          <w:p>
+            <w:pPr>
+              <w:spacing w:after="0" w:line="240" w:lineRule="auto"/>
+            </w:pPr>
+            <w:r>
+              <w:rPr>
+                <w:rFonts w:ascii="Consolas" w:hAnsi="Consolas"/>
+                <w:color w:val="2D2D2D"/>
+                <w:sz w:val="18"/>
+              </w:rPr>
+              <w:t>metadata</w:t>
+            </w:r>
+          </w:p>
+        </w:tc>
+        <w:tc>
+          <w:tcPr>
+            <w:tcW w:type="dxa" w:w="1512"/>
+            <w:vAlign w:val="center"/>
+            <w:tcMar>
+              <w:top w:w="90" w:type="dxa"/>
+              <w:start w:w="100" w:type="dxa"/>
+              <w:bottom w:w="90" w:type="dxa"/>
+              <w:end w:w="100" w:type="dxa"/>
+            </w:tcMar>
+          </w:tcPr>
+          <w:p>
+            <w:pPr>
+              <w:spacing w:after="0" w:line="240" w:lineRule="auto"/>
+            </w:pPr>
+            <w:r>
+              <w:rPr>
+                <w:rFonts w:ascii="Aptos" w:hAnsi="Aptos"/>
+                <w:b w:val="0"/>
+                <w:sz w:val="18"/>
+              </w:rPr>
+              <w:t>object</w:t>
+            </w:r>
+          </w:p>
+        </w:tc>
+        <w:tc>
+          <w:tcPr>
+            <w:tcW w:type="dxa" w:w="6278"/>
+            <w:vAlign w:val="center"/>
+            <w:tcMar>
+              <w:top w:w="90" w:type="dxa"/>
+              <w:start w:w="100" w:type="dxa"/>
+              <w:bottom w:w="90" w:type="dxa"/>
+              <w:end w:w="100" w:type="dxa"/>
+            </w:tcMar>
+          </w:tcPr>
+          <w:p>
+            <w:pPr>
+              <w:spacing w:after="0" w:line="240" w:lineRule="auto"/>
+            </w:pPr>
+            <w:r>
+              <w:rPr>
+                <w:rFonts w:ascii="Aptos" w:hAnsi="Aptos"/>
+                <w:b w:val="0"/>
+                <w:sz w:val="18"/>
+              </w:rPr>
+              <w:t>Dataset identity, date range, snapshot count, UTC time basis, and snapshot semantics.</w:t>
+            </w:r>
+          </w:p>
+        </w:tc>
+      </w:tr>
+      <w:tr>
+        <w:trPr>
+          <w:cantSplit w:val="true"/>
+        </w:trPr>
+        <w:tc>
+          <w:tcPr>
+            <w:tcW w:type="dxa" w:w="2376"/>
+            <w:vAlign w:val="center"/>
+            <w:tcMar>
+              <w:top w:w="90" w:type="dxa"/>
+              <w:start w:w="100" w:type="dxa"/>
+              <w:bottom w:w="90" w:type="dxa"/>
+              <w:end w:w="100" w:type="dxa"/>
+            </w:tcMar>
+            <w:shd w:fill="EAF1F8"/>
+          </w:tcPr>
+          <w:p>
+            <w:pPr>
+              <w:spacing w:after="0" w:line="240" w:lineRule="auto"/>
+            </w:pPr>
+            <w:r>
+              <w:rPr>
+                <w:rFonts w:ascii="Consolas" w:hAnsi="Consolas"/>
+                <w:color w:val="2D2D2D"/>
+                <w:sz w:val="18"/>
+              </w:rPr>
+              <w:t>snapshots</w:t>
+            </w:r>
+          </w:p>
+        </w:tc>
+        <w:tc>
+          <w:tcPr>
+            <w:tcW w:type="dxa" w:w="1512"/>
+            <w:vAlign w:val="center"/>
+            <w:tcMar>
+              <w:top w:w="90" w:type="dxa"/>
+              <w:start w:w="100" w:type="dxa"/>
+              <w:bottom w:w="90" w:type="dxa"/>
+              <w:end w:w="100" w:type="dxa"/>
+            </w:tcMar>
+            <w:shd w:fill="EAF1F8"/>
+          </w:tcPr>
+          <w:p>
+            <w:pPr>
+              <w:spacing w:after="0" w:line="240" w:lineRule="auto"/>
+            </w:pPr>
+            <w:r>
+              <w:rPr>
+                <w:rFonts w:ascii="Aptos" w:hAnsi="Aptos"/>
+                <w:b w:val="0"/>
+                <w:sz w:val="18"/>
+              </w:rPr>
+              <w:t>array of objects</w:t>
+            </w:r>
+          </w:p>
+        </w:tc>
+        <w:tc>
+          <w:tcPr>
+            <w:tcW w:type="dxa" w:w="6278"/>
+            <w:vAlign w:val="center"/>
+            <w:tcMar>
+              <w:top w:w="90" w:type="dxa"/>
+              <w:start w:w="100" w:type="dxa"/>
+              <w:bottom w:w="90" w:type="dxa"/>
+              <w:end w:w="100" w:type="dxa"/>
+            </w:tcMar>
+            <w:shd w:fill="EAF1F8"/>
+          </w:tcPr>
+          <w:p>
+            <w:pPr>
+              <w:spacing w:after="0" w:line="240" w:lineRule="auto"/>
+            </w:pPr>
+            <w:r>
+              <w:rPr>
+                <w:rFonts w:ascii="Aptos" w:hAnsi="Aptos"/>
+                <w:b w:val="0"/>
+                <w:sz w:val="18"/>
+              </w:rPr>
+              <w:t>Five independent daily SOD status snapshots.</w:t>
+            </w:r>
+          </w:p>
+        </w:tc>
+      </w:tr>
+    </w:tbl>
+    <w:p>
+      <w:pPr>
+        <w:spacing w:after="40"/>
+      </w:pPr>
+    </w:p>
+    <w:p>
+      <w:pPr>
+        <w:pStyle w:val="Heading3"/>
+      </w:pPr>
+      <w:r>
+        <w:t>Each object in snapshots contains</w:t>
       </w:r>
     </w:p>
     <w:tbl>
@@ -1883,6 +2203,118 @@
                 <w:sz w:val="18"/>
               </w:rPr>
               <w:t>Timestamp at which the snapshot was captured.</w:t>
+            </w:r>
+          </w:p>
+        </w:tc>
+      </w:tr>
+      <w:tr>
+        <w:trPr>
+          <w:cantSplit w:val="true"/>
+        </w:trPr>
+        <w:tc>
+          <w:tcPr>
+            <w:tcW w:type="dxa" w:w="2880"/>
+            <w:vAlign w:val="center"/>
+            <w:tcMar>
+              <w:top w:w="90" w:type="dxa"/>
+              <w:start w:w="100" w:type="dxa"/>
+              <w:bottom w:w="90" w:type="dxa"/>
+              <w:end w:w="100" w:type="dxa"/>
+            </w:tcMar>
+          </w:tcPr>
+          <w:p>
+            <w:pPr>
+              <w:spacing w:after="0" w:line="240" w:lineRule="auto"/>
+            </w:pPr>
+            <w:r>
+              <w:rPr>
+                <w:rFonts w:ascii="Consolas" w:hAnsi="Consolas"/>
+                <w:color w:val="2D2D2D"/>
+                <w:sz w:val="18"/>
+              </w:rPr>
+              <w:t>scenario_id</w:t>
+            </w:r>
+          </w:p>
+        </w:tc>
+        <w:tc>
+          <w:tcPr>
+            <w:tcW w:type="dxa" w:w="7286"/>
+            <w:vAlign w:val="center"/>
+            <w:tcMar>
+              <w:top w:w="90" w:type="dxa"/>
+              <w:start w:w="100" w:type="dxa"/>
+              <w:bottom w:w="90" w:type="dxa"/>
+              <w:end w:w="100" w:type="dxa"/>
+            </w:tcMar>
+          </w:tcPr>
+          <w:p>
+            <w:pPr>
+              <w:spacing w:after="0" w:line="240" w:lineRule="auto"/>
+            </w:pPr>
+            <w:r>
+              <w:rPr>
+                <w:rFonts w:ascii="Aptos" w:hAnsi="Aptos"/>
+                <w:b w:val="0"/>
+                <w:sz w:val="18"/>
+              </w:rPr>
+              <w:t>Short machine-readable label for the operational scenario.</w:t>
+            </w:r>
+          </w:p>
+        </w:tc>
+      </w:tr>
+      <w:tr>
+        <w:trPr>
+          <w:cantSplit w:val="true"/>
+        </w:trPr>
+        <w:tc>
+          <w:tcPr>
+            <w:tcW w:type="dxa" w:w="2880"/>
+            <w:vAlign w:val="center"/>
+            <w:tcMar>
+              <w:top w:w="90" w:type="dxa"/>
+              <w:start w:w="100" w:type="dxa"/>
+              <w:bottom w:w="90" w:type="dxa"/>
+              <w:end w:w="100" w:type="dxa"/>
+            </w:tcMar>
+            <w:shd w:fill="EAF1F8"/>
+          </w:tcPr>
+          <w:p>
+            <w:pPr>
+              <w:spacing w:after="0" w:line="240" w:lineRule="auto"/>
+            </w:pPr>
+            <w:r>
+              <w:rPr>
+                <w:rFonts w:ascii="Consolas" w:hAnsi="Consolas"/>
+                <w:color w:val="2D2D2D"/>
+                <w:sz w:val="18"/>
+              </w:rPr>
+              <w:t>scenario_description</w:t>
+            </w:r>
+          </w:p>
+        </w:tc>
+        <w:tc>
+          <w:tcPr>
+            <w:tcW w:type="dxa" w:w="7286"/>
+            <w:vAlign w:val="center"/>
+            <w:tcMar>
+              <w:top w:w="90" w:type="dxa"/>
+              <w:start w:w="100" w:type="dxa"/>
+              <w:bottom w:w="90" w:type="dxa"/>
+              <w:end w:w="100" w:type="dxa"/>
+            </w:tcMar>
+            <w:shd w:fill="EAF1F8"/>
+          </w:tcPr>
+          <w:p>
+            <w:pPr>
+              <w:spacing w:after="0" w:line="240" w:lineRule="auto"/>
+            </w:pPr>
+            <w:r>
+              <w:rPr>
+                <w:rFonts w:ascii="Aptos" w:hAnsi="Aptos"/>
+                <w:b w:val="0"/>
+                <w:sz w:val="18"/>
+              </w:rPr>
+              <w:t>Human-readable explanation of the scenario.</w:t>
             </w:r>
           </w:p>
         </w:tc>
@@ -2277,6 +2709,533 @@
         </w:rPr>
         <w:t>.</w:t>
       </w:r>
+    </w:p>
+    <w:p>
+      <w:pPr>
+        <w:pStyle w:val="Heading2"/>
+      </w:pPr>
+      <w:r>
+        <w:t>Included daily scenarios</w:t>
+      </w:r>
+    </w:p>
+    <w:tbl>
+      <w:tblPr>
+        <w:tblW w:type="auto" w:w="0"/>
+        <w:jc w:val="center"/>
+        <w:tblLayout w:type="fixed"/>
+        <w:tblLook w:firstColumn="1" w:firstRow="1" w:lastColumn="0" w:lastRow="0" w:noHBand="0" w:noVBand="1" w:val="04A0"/>
+        <w:tblBorders>
+          <w:top w:val="single" w:sz="4" w:color="D9D9D9"/>
+          <w:left w:val="single" w:sz="4" w:color="D9D9D9"/>
+          <w:bottom w:val="single" w:sz="4" w:color="D9D9D9"/>
+          <w:right w:val="single" w:sz="4" w:color="D9D9D9"/>
+          <w:insideH w:val="single" w:sz="4" w:color="D9D9D9"/>
+          <w:insideV w:val="single" w:sz="4" w:color="D9D9D9"/>
+        </w:tblBorders>
+      </w:tblPr>
+      <w:tblGrid>
+        <w:gridCol w:w="3389"/>
+        <w:gridCol w:w="3389"/>
+        <w:gridCol w:w="3389"/>
+      </w:tblGrid>
+      <w:tr>
+        <w:trPr>
+          <w:tblHeader w:val="true"/>
+          <w:cantSplit w:val="true"/>
+        </w:trPr>
+        <w:tc>
+          <w:tcPr>
+            <w:tcW w:type="dxa" w:w="2376"/>
+            <w:vAlign w:val="center"/>
+            <w:tcMar>
+              <w:top w:w="90" w:type="dxa"/>
+              <w:start w:w="100" w:type="dxa"/>
+              <w:bottom w:w="90" w:type="dxa"/>
+              <w:end w:w="100" w:type="dxa"/>
+            </w:tcMar>
+            <w:shd w:fill="17365D"/>
+          </w:tcPr>
+          <w:p>
+            <w:pPr>
+              <w:spacing w:after="0" w:line="240" w:lineRule="auto"/>
+            </w:pPr>
+            <w:r>
+              <w:rPr>
+                <w:rFonts w:ascii="Aptos" w:hAnsi="Aptos"/>
+                <w:b/>
+                <w:color w:val="FFFFFF"/>
+                <w:sz w:val="18"/>
+              </w:rPr>
+              <w:t>Business date</w:t>
+            </w:r>
+          </w:p>
+        </w:tc>
+        <w:tc>
+          <w:tcPr>
+            <w:tcW w:type="dxa" w:w="1512"/>
+            <w:vAlign w:val="center"/>
+            <w:tcMar>
+              <w:top w:w="90" w:type="dxa"/>
+              <w:start w:w="100" w:type="dxa"/>
+              <w:bottom w:w="90" w:type="dxa"/>
+              <w:end w:w="100" w:type="dxa"/>
+            </w:tcMar>
+            <w:shd w:fill="17365D"/>
+          </w:tcPr>
+          <w:p>
+            <w:pPr>
+              <w:spacing w:after="0" w:line="240" w:lineRule="auto"/>
+            </w:pPr>
+            <w:r>
+              <w:rPr>
+                <w:rFonts w:ascii="Aptos" w:hAnsi="Aptos"/>
+                <w:b/>
+                <w:color w:val="FFFFFF"/>
+                <w:sz w:val="18"/>
+              </w:rPr>
+              <w:t>Scenario ID</w:t>
+            </w:r>
+          </w:p>
+        </w:tc>
+        <w:tc>
+          <w:tcPr>
+            <w:tcW w:type="dxa" w:w="6278"/>
+            <w:vAlign w:val="center"/>
+            <w:tcMar>
+              <w:top w:w="90" w:type="dxa"/>
+              <w:start w:w="100" w:type="dxa"/>
+              <w:bottom w:w="90" w:type="dxa"/>
+              <w:end w:w="100" w:type="dxa"/>
+            </w:tcMar>
+            <w:shd w:fill="17365D"/>
+          </w:tcPr>
+          <w:p>
+            <w:pPr>
+              <w:spacing w:after="0" w:line="240" w:lineRule="auto"/>
+            </w:pPr>
+            <w:r>
+              <w:rPr>
+                <w:rFonts w:ascii="Aptos" w:hAnsi="Aptos"/>
+                <w:b/>
+                <w:color w:val="FFFFFF"/>
+                <w:sz w:val="18"/>
+              </w:rPr>
+              <w:t>EMEA state represented</w:t>
+            </w:r>
+          </w:p>
+        </w:tc>
+      </w:tr>
+      <w:tr>
+        <w:trPr>
+          <w:cantSplit w:val="true"/>
+        </w:trPr>
+        <w:tc>
+          <w:tcPr>
+            <w:tcW w:type="dxa" w:w="2376"/>
+            <w:vAlign w:val="center"/>
+            <w:tcMar>
+              <w:top w:w="90" w:type="dxa"/>
+              <w:start w:w="100" w:type="dxa"/>
+              <w:bottom w:w="90" w:type="dxa"/>
+              <w:end w:w="100" w:type="dxa"/>
+            </w:tcMar>
+          </w:tcPr>
+          <w:p>
+            <w:pPr>
+              <w:spacing w:after="0" w:line="240" w:lineRule="auto"/>
+            </w:pPr>
+            <w:r>
+              <w:rPr>
+                <w:rFonts w:ascii="Consolas" w:hAnsi="Consolas"/>
+                <w:color w:val="2D2D2D"/>
+                <w:sz w:val="18"/>
+              </w:rPr>
+              <w:t>2026-09-21</w:t>
+            </w:r>
+          </w:p>
+        </w:tc>
+        <w:tc>
+          <w:tcPr>
+            <w:tcW w:type="dxa" w:w="1512"/>
+            <w:vAlign w:val="center"/>
+            <w:tcMar>
+              <w:top w:w="90" w:type="dxa"/>
+              <w:start w:w="100" w:type="dxa"/>
+              <w:bottom w:w="90" w:type="dxa"/>
+              <w:end w:w="100" w:type="dxa"/>
+            </w:tcMar>
+          </w:tcPr>
+          <w:p>
+            <w:pPr>
+              <w:spacing w:after="0" w:line="240" w:lineRule="auto"/>
+            </w:pPr>
+            <w:r>
+              <w:rPr>
+                <w:rFonts w:ascii="Consolas" w:hAnsi="Consolas"/>
+                <w:color w:val="2D2D2D"/>
+                <w:sz w:val="18"/>
+              </w:rPr>
+              <w:t>extract_delayed</w:t>
+            </w:r>
+          </w:p>
+        </w:tc>
+        <w:tc>
+          <w:tcPr>
+            <w:tcW w:type="dxa" w:w="6278"/>
+            <w:vAlign w:val="center"/>
+            <w:tcMar>
+              <w:top w:w="90" w:type="dxa"/>
+              <w:start w:w="100" w:type="dxa"/>
+              <w:bottom w:w="90" w:type="dxa"/>
+              <w:end w:w="100" w:type="dxa"/>
+            </w:tcMar>
+          </w:tcPr>
+          <w:p>
+            <w:pPr>
+              <w:spacing w:after="0" w:line="240" w:lineRule="auto"/>
+            </w:pPr>
+            <w:r>
+              <w:rPr>
+                <w:rFonts w:ascii="Aptos" w:hAnsi="Aptos"/>
+                <w:b w:val="0"/>
+                <w:sz w:val="18"/>
+              </w:rPr>
+              <w:t>Transaction extraction is still running and downstream work is waiting.</w:t>
+            </w:r>
+          </w:p>
+        </w:tc>
+      </w:tr>
+      <w:tr>
+        <w:trPr>
+          <w:cantSplit w:val="true"/>
+        </w:trPr>
+        <w:tc>
+          <w:tcPr>
+            <w:tcW w:type="dxa" w:w="2376"/>
+            <w:vAlign w:val="center"/>
+            <w:tcMar>
+              <w:top w:w="90" w:type="dxa"/>
+              <w:start w:w="100" w:type="dxa"/>
+              <w:bottom w:w="90" w:type="dxa"/>
+              <w:end w:w="100" w:type="dxa"/>
+            </w:tcMar>
+            <w:shd w:fill="EAF1F8"/>
+          </w:tcPr>
+          <w:p>
+            <w:pPr>
+              <w:spacing w:after="0" w:line="240" w:lineRule="auto"/>
+            </w:pPr>
+            <w:r>
+              <w:rPr>
+                <w:rFonts w:ascii="Consolas" w:hAnsi="Consolas"/>
+                <w:color w:val="2D2D2D"/>
+                <w:sz w:val="18"/>
+              </w:rPr>
+              <w:t>2026-09-22</w:t>
+            </w:r>
+          </w:p>
+        </w:tc>
+        <w:tc>
+          <w:tcPr>
+            <w:tcW w:type="dxa" w:w="1512"/>
+            <w:vAlign w:val="center"/>
+            <w:tcMar>
+              <w:top w:w="90" w:type="dxa"/>
+              <w:start w:w="100" w:type="dxa"/>
+              <w:bottom w:w="90" w:type="dxa"/>
+              <w:end w:w="100" w:type="dxa"/>
+            </w:tcMar>
+            <w:shd w:fill="EAF1F8"/>
+          </w:tcPr>
+          <w:p>
+            <w:pPr>
+              <w:spacing w:after="0" w:line="240" w:lineRule="auto"/>
+            </w:pPr>
+            <w:r>
+              <w:rPr>
+                <w:rFonts w:ascii="Consolas" w:hAnsi="Consolas"/>
+                <w:color w:val="2D2D2D"/>
+                <w:sz w:val="18"/>
+              </w:rPr>
+              <w:t>enrichment_running</w:t>
+            </w:r>
+          </w:p>
+        </w:tc>
+        <w:tc>
+          <w:tcPr>
+            <w:tcW w:type="dxa" w:w="6278"/>
+            <w:vAlign w:val="center"/>
+            <w:tcMar>
+              <w:top w:w="90" w:type="dxa"/>
+              <w:start w:w="100" w:type="dxa"/>
+              <w:bottom w:w="90" w:type="dxa"/>
+              <w:end w:w="100" w:type="dxa"/>
+            </w:tcMar>
+            <w:shd w:fill="EAF1F8"/>
+          </w:tcPr>
+          <w:p>
+            <w:pPr>
+              <w:spacing w:after="0" w:line="240" w:lineRule="auto"/>
+            </w:pPr>
+            <w:r>
+              <w:rPr>
+                <w:rFonts w:ascii="Aptos" w:hAnsi="Aptos"/>
+                <w:b w:val="0"/>
+                <w:sz w:val="18"/>
+              </w:rPr>
+              <w:t>Extracts and validation succeeded; data enrichment is running.</w:t>
+            </w:r>
+          </w:p>
+        </w:tc>
+      </w:tr>
+      <w:tr>
+        <w:trPr>
+          <w:cantSplit w:val="true"/>
+        </w:trPr>
+        <w:tc>
+          <w:tcPr>
+            <w:tcW w:type="dxa" w:w="2376"/>
+            <w:vAlign w:val="center"/>
+            <w:tcMar>
+              <w:top w:w="90" w:type="dxa"/>
+              <w:start w:w="100" w:type="dxa"/>
+              <w:bottom w:w="90" w:type="dxa"/>
+              <w:end w:w="100" w:type="dxa"/>
+            </w:tcMar>
+          </w:tcPr>
+          <w:p>
+            <w:pPr>
+              <w:spacing w:after="0" w:line="240" w:lineRule="auto"/>
+            </w:pPr>
+            <w:r>
+              <w:rPr>
+                <w:rFonts w:ascii="Consolas" w:hAnsi="Consolas"/>
+                <w:color w:val="2D2D2D"/>
+                <w:sz w:val="18"/>
+              </w:rPr>
+              <w:t>2026-09-23</w:t>
+            </w:r>
+          </w:p>
+        </w:tc>
+        <w:tc>
+          <w:tcPr>
+            <w:tcW w:type="dxa" w:w="1512"/>
+            <w:vAlign w:val="center"/>
+            <w:tcMar>
+              <w:top w:w="90" w:type="dxa"/>
+              <w:start w:w="100" w:type="dxa"/>
+              <w:bottom w:w="90" w:type="dxa"/>
+              <w:end w:w="100" w:type="dxa"/>
+            </w:tcMar>
+          </w:tcPr>
+          <w:p>
+            <w:pPr>
+              <w:spacing w:after="0" w:line="240" w:lineRule="auto"/>
+            </w:pPr>
+            <w:r>
+              <w:rPr>
+                <w:rFonts w:ascii="Consolas" w:hAnsi="Consolas"/>
+                <w:color w:val="2D2D2D"/>
+                <w:sz w:val="18"/>
+              </w:rPr>
+              <w:t>report_build_running</w:t>
+            </w:r>
+          </w:p>
+        </w:tc>
+        <w:tc>
+          <w:tcPr>
+            <w:tcW w:type="dxa" w:w="6278"/>
+            <w:vAlign w:val="center"/>
+            <w:tcMar>
+              <w:top w:w="90" w:type="dxa"/>
+              <w:start w:w="100" w:type="dxa"/>
+              <w:bottom w:w="90" w:type="dxa"/>
+              <w:end w:w="100" w:type="dxa"/>
+            </w:tcMar>
+          </w:tcPr>
+          <w:p>
+            <w:pPr>
+              <w:spacing w:after="0" w:line="240" w:lineRule="auto"/>
+            </w:pPr>
+            <w:r>
+              <w:rPr>
+                <w:rFonts w:ascii="Aptos" w:hAnsi="Aptos"/>
+                <w:b w:val="0"/>
+                <w:sz w:val="18"/>
+              </w:rPr>
+              <w:t>Report construction is running while publication waits.</w:t>
+            </w:r>
+          </w:p>
+        </w:tc>
+      </w:tr>
+      <w:tr>
+        <w:trPr>
+          <w:cantSplit w:val="true"/>
+        </w:trPr>
+        <w:tc>
+          <w:tcPr>
+            <w:tcW w:type="dxa" w:w="2376"/>
+            <w:vAlign w:val="center"/>
+            <w:tcMar>
+              <w:top w:w="90" w:type="dxa"/>
+              <w:start w:w="100" w:type="dxa"/>
+              <w:bottom w:w="90" w:type="dxa"/>
+              <w:end w:w="100" w:type="dxa"/>
+            </w:tcMar>
+            <w:shd w:fill="EAF1F8"/>
+          </w:tcPr>
+          <w:p>
+            <w:pPr>
+              <w:spacing w:after="0" w:line="240" w:lineRule="auto"/>
+            </w:pPr>
+            <w:r>
+              <w:rPr>
+                <w:rFonts w:ascii="Consolas" w:hAnsi="Consolas"/>
+                <w:color w:val="2D2D2D"/>
+                <w:sz w:val="18"/>
+              </w:rPr>
+              <w:t>2026-09-24</w:t>
+            </w:r>
+          </w:p>
+        </w:tc>
+        <w:tc>
+          <w:tcPr>
+            <w:tcW w:type="dxa" w:w="1512"/>
+            <w:vAlign w:val="center"/>
+            <w:tcMar>
+              <w:top w:w="90" w:type="dxa"/>
+              <w:start w:w="100" w:type="dxa"/>
+              <w:bottom w:w="90" w:type="dxa"/>
+              <w:end w:w="100" w:type="dxa"/>
+            </w:tcMar>
+            <w:shd w:fill="EAF1F8"/>
+          </w:tcPr>
+          <w:p>
+            <w:pPr>
+              <w:spacing w:after="0" w:line="240" w:lineRule="auto"/>
+            </w:pPr>
+            <w:r>
+              <w:rPr>
+                <w:rFonts w:ascii="Consolas" w:hAnsi="Consolas"/>
+                <w:color w:val="2D2D2D"/>
+                <w:sz w:val="18"/>
+              </w:rPr>
+              <w:t>validation_failed</w:t>
+            </w:r>
+          </w:p>
+        </w:tc>
+        <w:tc>
+          <w:tcPr>
+            <w:tcW w:type="dxa" w:w="6278"/>
+            <w:vAlign w:val="center"/>
+            <w:tcMar>
+              <w:top w:w="90" w:type="dxa"/>
+              <w:start w:w="100" w:type="dxa"/>
+              <w:bottom w:w="90" w:type="dxa"/>
+              <w:end w:w="100" w:type="dxa"/>
+            </w:tcMar>
+            <w:shd w:fill="EAF1F8"/>
+          </w:tcPr>
+          <w:p>
+            <w:pPr>
+              <w:spacing w:after="0" w:line="240" w:lineRule="auto"/>
+            </w:pPr>
+            <w:r>
+              <w:rPr>
+                <w:rFonts w:ascii="Aptos" w:hAnsi="Aptos"/>
+                <w:b w:val="0"/>
+                <w:sz w:val="18"/>
+              </w:rPr>
+              <w:t>Validation failed and five downstream CMD jobs are blocked.</w:t>
+            </w:r>
+          </w:p>
+        </w:tc>
+      </w:tr>
+      <w:tr>
+        <w:trPr>
+          <w:cantSplit w:val="true"/>
+        </w:trPr>
+        <w:tc>
+          <w:tcPr>
+            <w:tcW w:type="dxa" w:w="2376"/>
+            <w:vAlign w:val="center"/>
+            <w:tcMar>
+              <w:top w:w="90" w:type="dxa"/>
+              <w:start w:w="100" w:type="dxa"/>
+              <w:bottom w:w="90" w:type="dxa"/>
+              <w:end w:w="100" w:type="dxa"/>
+            </w:tcMar>
+          </w:tcPr>
+          <w:p>
+            <w:pPr>
+              <w:spacing w:after="0" w:line="240" w:lineRule="auto"/>
+            </w:pPr>
+            <w:r>
+              <w:rPr>
+                <w:rFonts w:ascii="Consolas" w:hAnsi="Consolas"/>
+                <w:color w:val="2D2D2D"/>
+                <w:sz w:val="18"/>
+              </w:rPr>
+              <w:t>2026-09-25</w:t>
+            </w:r>
+          </w:p>
+        </w:tc>
+        <w:tc>
+          <w:tcPr>
+            <w:tcW w:type="dxa" w:w="1512"/>
+            <w:vAlign w:val="center"/>
+            <w:tcMar>
+              <w:top w:w="90" w:type="dxa"/>
+              <w:start w:w="100" w:type="dxa"/>
+              <w:bottom w:w="90" w:type="dxa"/>
+              <w:end w:w="100" w:type="dxa"/>
+            </w:tcMar>
+          </w:tcPr>
+          <w:p>
+            <w:pPr>
+              <w:spacing w:after="0" w:line="240" w:lineRule="auto"/>
+            </w:pPr>
+            <w:r>
+              <w:rPr>
+                <w:rFonts w:ascii="Consolas" w:hAnsi="Consolas"/>
+                <w:color w:val="2D2D2D"/>
+                <w:sz w:val="18"/>
+              </w:rPr>
+              <w:t>recovery_complete</w:t>
+            </w:r>
+          </w:p>
+        </w:tc>
+        <w:tc>
+          <w:tcPr>
+            <w:tcW w:type="dxa" w:w="6278"/>
+            <w:vAlign w:val="center"/>
+            <w:tcMar>
+              <w:top w:w="90" w:type="dxa"/>
+              <w:start w:w="100" w:type="dxa"/>
+              <w:bottom w:w="90" w:type="dxa"/>
+              <w:end w:w="100" w:type="dxa"/>
+            </w:tcMar>
+          </w:tcPr>
+          <w:p>
+            <w:pPr>
+              <w:spacing w:after="0" w:line="240" w:lineRule="auto"/>
+            </w:pPr>
+            <w:r>
+              <w:rPr>
+                <w:rFonts w:ascii="Aptos" w:hAnsi="Aptos"/>
+                <w:b w:val="0"/>
+                <w:sz w:val="18"/>
+              </w:rPr>
+              <w:t>The prior issue is resolved and the regional BOX completed successfully.</w:t>
+            </w:r>
+          </w:p>
+        </w:tc>
+      </w:tr>
+    </w:tbl>
+    <w:p>
+      <w:pPr>
+        <w:spacing w:after="40"/>
+      </w:pPr>
     </w:p>
     <w:p>
       <w:pPr>

</xml_diff>